<commit_message>
docs(submission): 竞赛提交材料数字族对齐 2026-10-20 真值（261/95.02%/1693）
- 机检真值（2026-10-21 复算）：verify_auth_coverage 261/248/13/95.02%；openapi 全量 244/262（/api 243/261）；CI run 39467891052 → 1693/38/1/0（约 1741 collected）
- submission/00_提交清单.md：§二真值表 + 端点口径表 + 复算命令 + 权威口径行（覆盖率 61%→57.19%，TEST_TRUTH 口径）
- 02_配套文档：开发说明书（§八 + 新增 v2.5 修订行 + 目录/接口表）、技术方案说明书、系统架构设计文档（mermaid/表格/演进段）、快速启动指南、测试说明书
- docx 实体 3 份外科手术同步（开发/测试/系统架构 从 1389/1428 族 → 1693/95.02/261；历史 v2.2 修订行按约定保留）
- pptx 重生成：作品演示PPT-最终版（此前实体停在 10-06 族 1389/1428，10-17 轮只改生成器未重生成）+ 路演PPT；METRICS 单一真值源同步
- 证据页 + build_roadshow_pptx.py + generate_demo_ppt.py + py-server/README + TEST_TRUTH（覆盖率 SSOT 95.02、openapi 244/262）
- 两份 reconciliation 文档：头块真值行更新 + 追加 2026-10-21 同步节（含「包内 openapi 逐字节一致」声称的遗留警告）
</commit_message>
<xml_diff>
--- a/submission/02_配套文档/docx/开发说明书.docx
+++ b/submission/02_配套文档/docx/开发说明书.docx
@@ -11773,7 +11773,7 @@
           <w:color w:val="1A1A2E"/>
           <w:sz w:val="21"/>
         </w:rPr>
-        <w:t>245 个 operations / 228 条 paths</w:t>
+        <w:t>261 个 operations / 243 条 paths</w:t>
       </w:r>
       <w:r>
         <w:rPr>
@@ -11793,7 +11793,7 @@
           <w:color w:val="1A1A2E"/>
           <w:sz w:val="21"/>
         </w:rPr>
-        <w:t>94.69%（232/245）</w:t>
+        <w:t>95.02%（248/261）</w:t>
       </w:r>
       <w:r>
         <w:rPr>
@@ -14912,7 +14912,7 @@
                 <w:color w:val="1A1A2E"/>
                 <w:sz w:val="18"/>
               </w:rPr>
-              <w:t>CI 默认档 1428 项（</w:t>
+              <w:t>CI 默认档 1732 项（</w:t>
             </w:r>
             <w:r>
               <w:rPr>
@@ -14922,17 +14922,17 @@
                 <w:color w:val="1A1A2E"/>
                 <w:sz w:val="17"/>
               </w:rPr>
-              <w:t>1436 collected</w:t>
-            </w:r>
-            <w:r>
-              <w:rPr>
-                <w:rFonts w:ascii="Calibri" w:hAnsi="Calibri" w:eastAsia="宋体"/>
-                <w:b w:val="0"/>
-                <w:i w:val="0"/>
-                <w:color w:val="1A1A2E"/>
-                <w:sz w:val="18"/>
-              </w:rPr>
-              <w:t>，addopts deselect 8）；1389 passed / 38 skipped / 1 xfailed / 0 failed</w:t>
+              <w:t>约 1741 collected</w:t>
+            </w:r>
+            <w:r>
+              <w:rPr>
+                <w:rFonts w:ascii="Calibri" w:hAnsi="Calibri" w:eastAsia="宋体"/>
+                <w:b w:val="0"/>
+                <w:i w:val="0"/>
+                <w:color w:val="1A1A2E"/>
+                <w:sz w:val="18"/>
+              </w:rPr>
+              <w:t>，addopts deselect 9）；1693 passed / 38 skipped / 1 xfailed / 0 failed</w:t>
             </w:r>
           </w:p>
         </w:tc>

</xml_diff>